<commit_message>
fix: replace 4 duplicate health questions with pre-existing conditions, PPO, COBRA events, ACA essential benefits
</commit_message>
<xml_diff>
--- a/public/Accident & Health Study Guide.docx
+++ b/public/Accident & Health Study Guide.docx
@@ -4218,100 +4218,100 @@
                 <w:sz w:val="22"/>
                 <w:szCs w:val="22"/>
               </w:rPr>
-              <w:t xml:space="preserve">An elimination period in a disability income insurance policy is:</w:t>
-            </w:r>
-          </w:p>
-        </w:tc>
-      </w:tr>
-      <w:tr>
-        <w:tc>
-          <w:tcPr>
-            <w:tcW w:type="dxa" w:w="9360"/>
-            <w:tcBorders>
-              <w:top w:val="single" w:color="CCCCCC" w:sz="1"/>
-              <w:left w:val="single" w:color="CCCCCC" w:sz="1"/>
-              <w:bottom w:val="single" w:color="CCCCCC" w:sz="1"/>
-              <w:right w:val="single" w:color="CCCCCC" w:sz="1"/>
-            </w:tcBorders>
-            <w:shd w:fill="FFFFFF" w:val="clear"/>
-            <w:tcMar>
-              <w:top w:type="dxa" w:w="60"/>
-              <w:left w:type="dxa" w:w="280"/>
-              <w:bottom w:type="dxa" w:w="60"/>
-              <w:right w:type="dxa" w:w="160"/>
-            </w:tcMar>
-          </w:tcPr>
-          <w:p>
-            <w:r>
-              <w:rPr>
-                <w:rFonts w:ascii="Arial" w:cs="Arial" w:eastAsia="Arial" w:hAnsi="Arial"/>
-                <w:color w:val="666666"/>
-                <w:sz w:val="21"/>
-                <w:szCs w:val="21"/>
-              </w:rPr>
-              <w:t xml:space="preserve">A) The period of time that benefits are payable</w:t>
-            </w:r>
-          </w:p>
-        </w:tc>
-      </w:tr>
-      <w:tr>
-        <w:tc>
-          <w:tcPr>
-            <w:tcW w:type="dxa" w:w="9360"/>
-            <w:tcBorders>
-              <w:top w:val="single" w:color="CCCCCC" w:sz="1"/>
-              <w:left w:val="single" w:color="CCCCCC" w:sz="1"/>
-              <w:bottom w:val="single" w:color="CCCCCC" w:sz="1"/>
-              <w:right w:val="single" w:color="CCCCCC" w:sz="1"/>
-            </w:tcBorders>
-            <w:shd w:fill="FFFFFF" w:val="clear"/>
-            <w:tcMar>
-              <w:top w:type="dxa" w:w="60"/>
-              <w:left w:type="dxa" w:w="280"/>
-              <w:bottom w:type="dxa" w:w="60"/>
-              <w:right w:type="dxa" w:w="160"/>
-            </w:tcMar>
-          </w:tcPr>
-          <w:p>
-            <w:r>
-              <w:rPr>
-                <w:rFonts w:ascii="Arial" w:cs="Arial" w:eastAsia="Arial" w:hAnsi="Arial"/>
-                <w:color w:val="666666"/>
-                <w:sz w:val="21"/>
-                <w:szCs w:val="21"/>
-              </w:rPr>
-              <w:t xml:space="preserve">B) The same thing as a grace period</w:t>
-            </w:r>
-          </w:p>
-        </w:tc>
-      </w:tr>
-      <w:tr>
-        <w:tc>
-          <w:tcPr>
-            <w:tcW w:type="dxa" w:w="9360"/>
-            <w:tcBorders>
-              <w:top w:val="single" w:color="CCCCCC" w:sz="1"/>
-              <w:left w:val="single" w:color="CCCCCC" w:sz="1"/>
-              <w:bottom w:val="single" w:color="CCCCCC" w:sz="1"/>
-              <w:right w:val="single" w:color="CCCCCC" w:sz="1"/>
-            </w:tcBorders>
-            <w:shd w:fill="FFFFFF" w:val="clear"/>
-            <w:tcMar>
-              <w:top w:type="dxa" w:w="60"/>
-              <w:left w:type="dxa" w:w="280"/>
-              <w:bottom w:type="dxa" w:w="60"/>
-              <w:right w:type="dxa" w:w="160"/>
-            </w:tcMar>
-          </w:tcPr>
-          <w:p>
-            <w:r>
-              <w:rPr>
-                <w:rFonts w:ascii="Arial" w:cs="Arial" w:eastAsia="Arial" w:hAnsi="Arial"/>
-                <w:color w:val="666666"/>
-                <w:sz w:val="21"/>
-                <w:szCs w:val="21"/>
-              </w:rPr>
-              <w:t xml:space="preserve">D) Not applicable separately to each period of disability</w:t>
+              <w:t xml:space="preserve">Under the Affordable Care Act (ACA), which of the following is an essential health benefit that qualified health plans must cover?</w:t>
+            </w:r>
+          </w:p>
+        </w:tc>
+      </w:tr>
+      <w:tr>
+        <w:tc>
+          <w:tcPr>
+            <w:tcW w:type="dxa" w:w="9360"/>
+            <w:tcBorders>
+              <w:top w:val="single" w:color="CCCCCC" w:sz="1"/>
+              <w:left w:val="single" w:color="CCCCCC" w:sz="1"/>
+              <w:bottom w:val="single" w:color="CCCCCC" w:sz="1"/>
+              <w:right w:val="single" w:color="CCCCCC" w:sz="1"/>
+            </w:tcBorders>
+            <w:shd w:fill="FFFFFF" w:val="clear"/>
+            <w:tcMar>
+              <w:top w:type="dxa" w:w="60"/>
+              <w:left w:type="dxa" w:w="280"/>
+              <w:bottom w:type="dxa" w:w="60"/>
+              <w:right w:type="dxa" w:w="160"/>
+            </w:tcMar>
+          </w:tcPr>
+          <w:p>
+            <w:r>
+              <w:rPr>
+                <w:rFonts w:ascii="Arial" w:cs="Arial" w:eastAsia="Arial" w:hAnsi="Arial"/>
+                <w:color w:val="666666"/>
+                <w:sz w:val="21"/>
+                <w:szCs w:val="21"/>
+              </w:rPr>
+              <w:t xml:space="preserve">A) Cosmetic surgery</w:t>
+            </w:r>
+          </w:p>
+        </w:tc>
+      </w:tr>
+      <w:tr>
+        <w:tc>
+          <w:tcPr>
+            <w:tcW w:type="dxa" w:w="9360"/>
+            <w:tcBorders>
+              <w:top w:val="single" w:color="CCCCCC" w:sz="1"/>
+              <w:left w:val="single" w:color="CCCCCC" w:sz="1"/>
+              <w:bottom w:val="single" w:color="CCCCCC" w:sz="1"/>
+              <w:right w:val="single" w:color="CCCCCC" w:sz="1"/>
+            </w:tcBorders>
+            <w:shd w:fill="FFFFFF" w:val="clear"/>
+            <w:tcMar>
+              <w:top w:type="dxa" w:w="60"/>
+              <w:left w:type="dxa" w:w="280"/>
+              <w:bottom w:type="dxa" w:w="60"/>
+              <w:right w:type="dxa" w:w="160"/>
+            </w:tcMar>
+          </w:tcPr>
+          <w:p>
+            <w:r>
+              <w:rPr>
+                <w:rFonts w:ascii="Arial" w:cs="Arial" w:eastAsia="Arial" w:hAnsi="Arial"/>
+                <w:color w:val="666666"/>
+                <w:sz w:val="21"/>
+                <w:szCs w:val="21"/>
+              </w:rPr>
+              <w:t xml:space="preserve">C) Long-term custodial care</w:t>
+            </w:r>
+          </w:p>
+        </w:tc>
+      </w:tr>
+      <w:tr>
+        <w:tc>
+          <w:tcPr>
+            <w:tcW w:type="dxa" w:w="9360"/>
+            <w:tcBorders>
+              <w:top w:val="single" w:color="CCCCCC" w:sz="1"/>
+              <w:left w:val="single" w:color="CCCCCC" w:sz="1"/>
+              <w:bottom w:val="single" w:color="CCCCCC" w:sz="1"/>
+              <w:right w:val="single" w:color="CCCCCC" w:sz="1"/>
+            </w:tcBorders>
+            <w:shd w:fill="FFFFFF" w:val="clear"/>
+            <w:tcMar>
+              <w:top w:type="dxa" w:w="60"/>
+              <w:left w:type="dxa" w:w="280"/>
+              <w:bottom w:type="dxa" w:w="60"/>
+              <w:right w:type="dxa" w:w="160"/>
+            </w:tcMar>
+          </w:tcPr>
+          <w:p>
+            <w:r>
+              <w:rPr>
+                <w:rFonts w:ascii="Arial" w:cs="Arial" w:eastAsia="Arial" w:hAnsi="Arial"/>
+                <w:color w:val="666666"/>
+                <w:sz w:val="21"/>
+                <w:szCs w:val="21"/>
+              </w:rPr>
+              <w:t xml:space="preserve">D) Dental implants for adults</w:t>
             </w:r>
           </w:p>
         </w:tc>
@@ -4355,7 +4355,7 @@
                 <w:sz w:val="22"/>
                 <w:szCs w:val="22"/>
               </w:rPr>
-              <w:t xml:space="preserve">C) A deductible measured in time rather than money</w:t>
+              <w:t xml:space="preserve">B) Maternity and newborn care</w:t>
             </w:r>
           </w:p>
         </w:tc>
@@ -4397,7 +4397,7 @@
                 <w:sz w:val="20"/>
                 <w:szCs w:val="20"/>
               </w:rPr>
-              <w:t xml:space="preserve">The elimination period is aptly described as a 'time deductible' — the insured must be disabled for a set number of days before benefits begin, just as a dollar deductible means the insured pays the first portion of a loss. Each new period of disability typically has its own elimination period unless a recurrent disability provision applies.</w:t>
+              <w:t xml:space="preserve">The ACA requires qualified health plans to cover 10 essential health benefit categories including: maternity and newborn care, mental health services, prescription drugs, preventive care, hospitalization, emergency services, lab services, pediatric services (including dental/vision), rehabilitative services, and ambulatory patient services. Cosmetic surgery and long-term custodial care are not essential health benefits.</w:t>
             </w:r>
           </w:p>
         </w:tc>
@@ -12369,100 +12369,100 @@
                 <w:sz w:val="22"/>
                 <w:szCs w:val="22"/>
               </w:rPr>
-              <w:t xml:space="preserve">When the employer pays the premium, covered individuals normally receive tax-free benefits under all of the following group health plans EXCEPT:</w:t>
-            </w:r>
-          </w:p>
-        </w:tc>
-      </w:tr>
-      <w:tr>
-        <w:tc>
-          <w:tcPr>
-            <w:tcW w:type="dxa" w:w="9360"/>
-            <w:tcBorders>
-              <w:top w:val="single" w:color="CCCCCC" w:sz="1"/>
-              <w:left w:val="single" w:color="CCCCCC" w:sz="1"/>
-              <w:bottom w:val="single" w:color="CCCCCC" w:sz="1"/>
-              <w:right w:val="single" w:color="CCCCCC" w:sz="1"/>
-            </w:tcBorders>
-            <w:shd w:fill="FFFFFF" w:val="clear"/>
-            <w:tcMar>
-              <w:top w:type="dxa" w:w="60"/>
-              <w:left w:type="dxa" w:w="280"/>
-              <w:bottom w:type="dxa" w:w="60"/>
-              <w:right w:type="dxa" w:w="160"/>
-            </w:tcMar>
-          </w:tcPr>
-          <w:p>
-            <w:r>
-              <w:rPr>
-                <w:rFonts w:ascii="Arial" w:cs="Arial" w:eastAsia="Arial" w:hAnsi="Arial"/>
-                <w:color w:val="666666"/>
-                <w:sz w:val="21"/>
-                <w:szCs w:val="21"/>
-              </w:rPr>
-              <w:t xml:space="preserve">B) Major medical</w:t>
-            </w:r>
-          </w:p>
-        </w:tc>
-      </w:tr>
-      <w:tr>
-        <w:tc>
-          <w:tcPr>
-            <w:tcW w:type="dxa" w:w="9360"/>
-            <w:tcBorders>
-              <w:top w:val="single" w:color="CCCCCC" w:sz="1"/>
-              <w:left w:val="single" w:color="CCCCCC" w:sz="1"/>
-              <w:bottom w:val="single" w:color="CCCCCC" w:sz="1"/>
-              <w:right w:val="single" w:color="CCCCCC" w:sz="1"/>
-            </w:tcBorders>
-            <w:shd w:fill="FFFFFF" w:val="clear"/>
-            <w:tcMar>
-              <w:top w:type="dxa" w:w="60"/>
-              <w:left w:type="dxa" w:w="280"/>
-              <w:bottom w:type="dxa" w:w="60"/>
-              <w:right w:type="dxa" w:w="160"/>
-            </w:tcMar>
-          </w:tcPr>
-          <w:p>
-            <w:r>
-              <w:rPr>
-                <w:rFonts w:ascii="Arial" w:cs="Arial" w:eastAsia="Arial" w:hAnsi="Arial"/>
-                <w:color w:val="666666"/>
-                <w:sz w:val="21"/>
-                <w:szCs w:val="21"/>
-              </w:rPr>
-              <w:t xml:space="preserve">C) Dental</w:t>
-            </w:r>
-          </w:p>
-        </w:tc>
-      </w:tr>
-      <w:tr>
-        <w:tc>
-          <w:tcPr>
-            <w:tcW w:type="dxa" w:w="9360"/>
-            <w:tcBorders>
-              <w:top w:val="single" w:color="CCCCCC" w:sz="1"/>
-              <w:left w:val="single" w:color="CCCCCC" w:sz="1"/>
-              <w:bottom w:val="single" w:color="CCCCCC" w:sz="1"/>
-              <w:right w:val="single" w:color="CCCCCC" w:sz="1"/>
-            </w:tcBorders>
-            <w:shd w:fill="FFFFFF" w:val="clear"/>
-            <w:tcMar>
-              <w:top w:type="dxa" w:w="60"/>
-              <w:left w:type="dxa" w:w="280"/>
-              <w:bottom w:type="dxa" w:w="60"/>
-              <w:right w:type="dxa" w:w="160"/>
-            </w:tcMar>
-          </w:tcPr>
-          <w:p>
-            <w:r>
-              <w:rPr>
-                <w:rFonts w:ascii="Arial" w:cs="Arial" w:eastAsia="Arial" w:hAnsi="Arial"/>
-                <w:color w:val="666666"/>
-                <w:sz w:val="21"/>
-                <w:szCs w:val="21"/>
-              </w:rPr>
-              <w:t xml:space="preserve">D) Health maintenance organization</w:t>
+              <w:t xml:space="preserve">A Preferred Provider Organization (PPO) differs from an HMO in that a PPO:</w:t>
+            </w:r>
+          </w:p>
+        </w:tc>
+      </w:tr>
+      <w:tr>
+        <w:tc>
+          <w:tcPr>
+            <w:tcW w:type="dxa" w:w="9360"/>
+            <w:tcBorders>
+              <w:top w:val="single" w:color="CCCCCC" w:sz="1"/>
+              <w:left w:val="single" w:color="CCCCCC" w:sz="1"/>
+              <w:bottom w:val="single" w:color="CCCCCC" w:sz="1"/>
+              <w:right w:val="single" w:color="CCCCCC" w:sz="1"/>
+            </w:tcBorders>
+            <w:shd w:fill="FFFFFF" w:val="clear"/>
+            <w:tcMar>
+              <w:top w:type="dxa" w:w="60"/>
+              <w:left w:type="dxa" w:w="280"/>
+              <w:bottom w:type="dxa" w:w="60"/>
+              <w:right w:type="dxa" w:w="160"/>
+            </w:tcMar>
+          </w:tcPr>
+          <w:p>
+            <w:r>
+              <w:rPr>
+                <w:rFonts w:ascii="Arial" w:cs="Arial" w:eastAsia="Arial" w:hAnsi="Arial"/>
+                <w:color w:val="666666"/>
+                <w:sz w:val="21"/>
+                <w:szCs w:val="21"/>
+              </w:rPr>
+              <w:t xml:space="preserve">A) Requires members to select a primary care physician as a gatekeeper</w:t>
+            </w:r>
+          </w:p>
+        </w:tc>
+      </w:tr>
+      <w:tr>
+        <w:tc>
+          <w:tcPr>
+            <w:tcW w:type="dxa" w:w="9360"/>
+            <w:tcBorders>
+              <w:top w:val="single" w:color="CCCCCC" w:sz="1"/>
+              <w:left w:val="single" w:color="CCCCCC" w:sz="1"/>
+              <w:bottom w:val="single" w:color="CCCCCC" w:sz="1"/>
+              <w:right w:val="single" w:color="CCCCCC" w:sz="1"/>
+            </w:tcBorders>
+            <w:shd w:fill="FFFFFF" w:val="clear"/>
+            <w:tcMar>
+              <w:top w:type="dxa" w:w="60"/>
+              <w:left w:type="dxa" w:w="280"/>
+              <w:bottom w:type="dxa" w:w="60"/>
+              <w:right w:type="dxa" w:w="160"/>
+            </w:tcMar>
+          </w:tcPr>
+          <w:p>
+            <w:r>
+              <w:rPr>
+                <w:rFonts w:ascii="Arial" w:cs="Arial" w:eastAsia="Arial" w:hAnsi="Arial"/>
+                <w:color w:val="666666"/>
+                <w:sz w:val="21"/>
+                <w:szCs w:val="21"/>
+              </w:rPr>
+              <w:t xml:space="preserve">C) Does not cover preventive care services</w:t>
+            </w:r>
+          </w:p>
+        </w:tc>
+      </w:tr>
+      <w:tr>
+        <w:tc>
+          <w:tcPr>
+            <w:tcW w:type="dxa" w:w="9360"/>
+            <w:tcBorders>
+              <w:top w:val="single" w:color="CCCCCC" w:sz="1"/>
+              <w:left w:val="single" w:color="CCCCCC" w:sz="1"/>
+              <w:bottom w:val="single" w:color="CCCCCC" w:sz="1"/>
+              <w:right w:val="single" w:color="CCCCCC" w:sz="1"/>
+            </w:tcBorders>
+            <w:shd w:fill="FFFFFF" w:val="clear"/>
+            <w:tcMar>
+              <w:top w:type="dxa" w:w="60"/>
+              <w:left w:type="dxa" w:w="280"/>
+              <w:bottom w:type="dxa" w:w="60"/>
+              <w:right w:type="dxa" w:w="160"/>
+            </w:tcMar>
+          </w:tcPr>
+          <w:p>
+            <w:r>
+              <w:rPr>
+                <w:rFonts w:ascii="Arial" w:cs="Arial" w:eastAsia="Arial" w:hAnsi="Arial"/>
+                <w:color w:val="666666"/>
+                <w:sz w:val="21"/>
+                <w:szCs w:val="21"/>
+              </w:rPr>
+              <w:t xml:space="preserve">D) Requires a referral for all specialist visits</w:t>
             </w:r>
           </w:p>
         </w:tc>
@@ -12506,7 +12506,7 @@
                 <w:sz w:val="22"/>
                 <w:szCs w:val="22"/>
               </w:rPr>
-              <w:t xml:space="preserve">A) Disability income</w:t>
+              <w:t xml:space="preserve">B) Allows members to see out-of-network providers at a higher cost-sharing level</w:t>
             </w:r>
           </w:p>
         </w:tc>
@@ -12548,7 +12548,7 @@
                 <w:sz w:val="20"/>
                 <w:szCs w:val="20"/>
               </w:rPr>
-              <w:t xml:space="preserve">When an employer pays 100% of the premium for group disability income, the benefits received by the employee are fully taxable as ordinary income. Medical (major medical), dental, and HMO benefits paid by employer-funded plans are received income-tax-free by employees.</w:t>
+              <w:t xml:space="preserve">PPOs allow members to see any provider, but offer lower cost-sharing (copays, deductibles) when using in-network providers. Unlike HMOs, PPOs do not require a primary care gatekeeper or referrals for specialists. Out-of-network care is covered but at higher out-of-pocket cost to the member.</w:t>
             </w:r>
           </w:p>
         </w:tc>
@@ -20233,100 +20233,100 @@
                 <w:sz w:val="22"/>
                 <w:szCs w:val="22"/>
               </w:rPr>
-              <w:t xml:space="preserve">Anything of value given to produce a contract is the definition of:</w:t>
-            </w:r>
-          </w:p>
-        </w:tc>
-      </w:tr>
-      <w:tr>
-        <w:tc>
-          <w:tcPr>
-            <w:tcW w:type="dxa" w:w="9360"/>
-            <w:tcBorders>
-              <w:top w:val="single" w:color="CCCCCC" w:sz="1"/>
-              <w:left w:val="single" w:color="CCCCCC" w:sz="1"/>
-              <w:bottom w:val="single" w:color="CCCCCC" w:sz="1"/>
-              <w:right w:val="single" w:color="CCCCCC" w:sz="1"/>
-            </w:tcBorders>
-            <w:shd w:fill="FFFFFF" w:val="clear"/>
-            <w:tcMar>
-              <w:top w:type="dxa" w:w="60"/>
-              <w:left w:type="dxa" w:w="280"/>
-              <w:bottom w:type="dxa" w:w="60"/>
-              <w:right w:type="dxa" w:w="160"/>
-            </w:tcMar>
-          </w:tcPr>
-          <w:p>
-            <w:r>
-              <w:rPr>
-                <w:rFonts w:ascii="Arial" w:cs="Arial" w:eastAsia="Arial" w:hAnsi="Arial"/>
-                <w:color w:val="666666"/>
-                <w:sz w:val="21"/>
-                <w:szCs w:val="21"/>
-              </w:rPr>
-              <w:t xml:space="preserve">A) A grant</w:t>
-            </w:r>
-          </w:p>
-        </w:tc>
-      </w:tr>
-      <w:tr>
-        <w:tc>
-          <w:tcPr>
-            <w:tcW w:type="dxa" w:w="9360"/>
-            <w:tcBorders>
-              <w:top w:val="single" w:color="CCCCCC" w:sz="1"/>
-              <w:left w:val="single" w:color="CCCCCC" w:sz="1"/>
-              <w:bottom w:val="single" w:color="CCCCCC" w:sz="1"/>
-              <w:right w:val="single" w:color="CCCCCC" w:sz="1"/>
-            </w:tcBorders>
-            <w:shd w:fill="FFFFFF" w:val="clear"/>
-            <w:tcMar>
-              <w:top w:type="dxa" w:w="60"/>
-              <w:left w:type="dxa" w:w="280"/>
-              <w:bottom w:type="dxa" w:w="60"/>
-              <w:right w:type="dxa" w:w="160"/>
-            </w:tcMar>
-          </w:tcPr>
-          <w:p>
-            <w:r>
-              <w:rPr>
-                <w:rFonts w:ascii="Arial" w:cs="Arial" w:eastAsia="Arial" w:hAnsi="Arial"/>
-                <w:color w:val="666666"/>
-                <w:sz w:val="21"/>
-                <w:szCs w:val="21"/>
-              </w:rPr>
-              <w:t xml:space="preserve">B) A codicil</w:t>
-            </w:r>
-          </w:p>
-        </w:tc>
-      </w:tr>
-      <w:tr>
-        <w:tc>
-          <w:tcPr>
-            <w:tcW w:type="dxa" w:w="9360"/>
-            <w:tcBorders>
-              <w:top w:val="single" w:color="CCCCCC" w:sz="1"/>
-              <w:left w:val="single" w:color="CCCCCC" w:sz="1"/>
-              <w:bottom w:val="single" w:color="CCCCCC" w:sz="1"/>
-              <w:right w:val="single" w:color="CCCCCC" w:sz="1"/>
-            </w:tcBorders>
-            <w:shd w:fill="FFFFFF" w:val="clear"/>
-            <w:tcMar>
-              <w:top w:type="dxa" w:w="60"/>
-              <w:left w:type="dxa" w:w="280"/>
-              <w:bottom w:type="dxa" w:w="60"/>
-              <w:right w:type="dxa" w:w="160"/>
-            </w:tcMar>
-          </w:tcPr>
-          <w:p>
-            <w:r>
-              <w:rPr>
-                <w:rFonts w:ascii="Arial" w:cs="Arial" w:eastAsia="Arial" w:hAnsi="Arial"/>
-                <w:color w:val="666666"/>
-                <w:sz w:val="21"/>
-                <w:szCs w:val="21"/>
-              </w:rPr>
-              <w:t xml:space="preserve">D) A covenant</w:t>
+              <w:t xml:space="preserve">A pre-existing condition limitation in a health insurance policy typically restricts coverage for conditions that were:</w:t>
+            </w:r>
+          </w:p>
+        </w:tc>
+      </w:tr>
+      <w:tr>
+        <w:tc>
+          <w:tcPr>
+            <w:tcW w:type="dxa" w:w="9360"/>
+            <w:tcBorders>
+              <w:top w:val="single" w:color="CCCCCC" w:sz="1"/>
+              <w:left w:val="single" w:color="CCCCCC" w:sz="1"/>
+              <w:bottom w:val="single" w:color="CCCCCC" w:sz="1"/>
+              <w:right w:val="single" w:color="CCCCCC" w:sz="1"/>
+            </w:tcBorders>
+            <w:shd w:fill="FFFFFF" w:val="clear"/>
+            <w:tcMar>
+              <w:top w:type="dxa" w:w="60"/>
+              <w:left w:type="dxa" w:w="280"/>
+              <w:bottom w:type="dxa" w:w="60"/>
+              <w:right w:type="dxa" w:w="160"/>
+            </w:tcMar>
+          </w:tcPr>
+          <w:p>
+            <w:r>
+              <w:rPr>
+                <w:rFonts w:ascii="Arial" w:cs="Arial" w:eastAsia="Arial" w:hAnsi="Arial"/>
+                <w:color w:val="666666"/>
+                <w:sz w:val="21"/>
+                <w:szCs w:val="21"/>
+              </w:rPr>
+              <w:t xml:space="preserve">B) Inherited from a family member</w:t>
+            </w:r>
+          </w:p>
+        </w:tc>
+      </w:tr>
+      <w:tr>
+        <w:tc>
+          <w:tcPr>
+            <w:tcW w:type="dxa" w:w="9360"/>
+            <w:tcBorders>
+              <w:top w:val="single" w:color="CCCCCC" w:sz="1"/>
+              <w:left w:val="single" w:color="CCCCCC" w:sz="1"/>
+              <w:bottom w:val="single" w:color="CCCCCC" w:sz="1"/>
+              <w:right w:val="single" w:color="CCCCCC" w:sz="1"/>
+            </w:tcBorders>
+            <w:shd w:fill="FFFFFF" w:val="clear"/>
+            <w:tcMar>
+              <w:top w:type="dxa" w:w="60"/>
+              <w:left w:type="dxa" w:w="280"/>
+              <w:bottom w:type="dxa" w:w="60"/>
+              <w:right w:type="dxa" w:w="160"/>
+            </w:tcMar>
+          </w:tcPr>
+          <w:p>
+            <w:r>
+              <w:rPr>
+                <w:rFonts w:ascii="Arial" w:cs="Arial" w:eastAsia="Arial" w:hAnsi="Arial"/>
+                <w:color w:val="666666"/>
+                <w:sz w:val="21"/>
+                <w:szCs w:val="21"/>
+              </w:rPr>
+              <w:t xml:space="preserve">C) Caused by an accident rather than an illness</w:t>
+            </w:r>
+          </w:p>
+        </w:tc>
+      </w:tr>
+      <w:tr>
+        <w:tc>
+          <w:tcPr>
+            <w:tcW w:type="dxa" w:w="9360"/>
+            <w:tcBorders>
+              <w:top w:val="single" w:color="CCCCCC" w:sz="1"/>
+              <w:left w:val="single" w:color="CCCCCC" w:sz="1"/>
+              <w:bottom w:val="single" w:color="CCCCCC" w:sz="1"/>
+              <w:right w:val="single" w:color="CCCCCC" w:sz="1"/>
+            </w:tcBorders>
+            <w:shd w:fill="FFFFFF" w:val="clear"/>
+            <w:tcMar>
+              <w:top w:type="dxa" w:w="60"/>
+              <w:left w:type="dxa" w:w="280"/>
+              <w:bottom w:type="dxa" w:w="60"/>
+              <w:right w:type="dxa" w:w="160"/>
+            </w:tcMar>
+          </w:tcPr>
+          <w:p>
+            <w:r>
+              <w:rPr>
+                <w:rFonts w:ascii="Arial" w:cs="Arial" w:eastAsia="Arial" w:hAnsi="Arial"/>
+                <w:color w:val="666666"/>
+                <w:sz w:val="21"/>
+                <w:szCs w:val="21"/>
+              </w:rPr>
+              <w:t xml:space="preserve">D) Treated by an out-of-network provider</w:t>
             </w:r>
           </w:p>
         </w:tc>
@@ -20370,7 +20370,7 @@
                 <w:sz w:val="22"/>
                 <w:szCs w:val="22"/>
               </w:rPr>
-              <w:t xml:space="preserve">C) A consideration</w:t>
+              <w:t xml:space="preserve">A) Diagnosed or treated within a specified period before the policy's effective date</w:t>
             </w:r>
           </w:p>
         </w:tc>
@@ -20412,7 +20412,7 @@
                 <w:sz w:val="20"/>
                 <w:szCs w:val="20"/>
               </w:rPr>
-              <w:t xml:space="preserve">Consideration is anything of legal value exchanged between contracting parties to make a contract binding. A codicil is an amendment to a will. A covenant is a formal promise. A grant transfers property rights.</w:t>
+              <w:t xml:space="preserve">A pre-existing condition limitation excludes or limits coverage for conditions that were diagnosed, treated, or for which medical advice was received within a specified lookback period (commonly 6 months) before the policy's effective date. The limitation typically expires after a waiting period (commonly 12 months of continuous coverage).</w:t>
             </w:r>
           </w:p>
         </w:tc>
@@ -22420,100 +22420,100 @@
                 <w:sz w:val="22"/>
                 <w:szCs w:val="22"/>
               </w:rPr>
-              <w:t xml:space="preserve">A producer who makes an incomplete comparison of policies to encourage an insured to cancel a contract of another insurer and purchase a new one is guilty of:</w:t>
-            </w:r>
-          </w:p>
-        </w:tc>
-      </w:tr>
-      <w:tr>
-        <w:tc>
-          <w:tcPr>
-            <w:tcW w:type="dxa" w:w="9360"/>
-            <w:tcBorders>
-              <w:top w:val="single" w:color="CCCCCC" w:sz="1"/>
-              <w:left w:val="single" w:color="CCCCCC" w:sz="1"/>
-              <w:bottom w:val="single" w:color="CCCCCC" w:sz="1"/>
-              <w:right w:val="single" w:color="CCCCCC" w:sz="1"/>
-            </w:tcBorders>
-            <w:shd w:fill="FFFFFF" w:val="clear"/>
-            <w:tcMar>
-              <w:top w:type="dxa" w:w="60"/>
-              <w:left w:type="dxa" w:w="280"/>
-              <w:bottom w:type="dxa" w:w="60"/>
-              <w:right w:type="dxa" w:w="160"/>
-            </w:tcMar>
-          </w:tcPr>
-          <w:p>
-            <w:r>
-              <w:rPr>
-                <w:rFonts w:ascii="Arial" w:cs="Arial" w:eastAsia="Arial" w:hAnsi="Arial"/>
-                <w:color w:val="666666"/>
-                <w:sz w:val="21"/>
-                <w:szCs w:val="21"/>
-              </w:rPr>
-              <w:t xml:space="preserve">A) Rebating</w:t>
-            </w:r>
-          </w:p>
-        </w:tc>
-      </w:tr>
-      <w:tr>
-        <w:tc>
-          <w:tcPr>
-            <w:tcW w:type="dxa" w:w="9360"/>
-            <w:tcBorders>
-              <w:top w:val="single" w:color="CCCCCC" w:sz="1"/>
-              <w:left w:val="single" w:color="CCCCCC" w:sz="1"/>
-              <w:bottom w:val="single" w:color="CCCCCC" w:sz="1"/>
-              <w:right w:val="single" w:color="CCCCCC" w:sz="1"/>
-            </w:tcBorders>
-            <w:shd w:fill="FFFFFF" w:val="clear"/>
-            <w:tcMar>
-              <w:top w:type="dxa" w:w="60"/>
-              <w:left w:type="dxa" w:w="280"/>
-              <w:bottom w:type="dxa" w:w="60"/>
-              <w:right w:type="dxa" w:w="160"/>
-            </w:tcMar>
-          </w:tcPr>
-          <w:p>
-            <w:r>
-              <w:rPr>
-                <w:rFonts w:ascii="Arial" w:cs="Arial" w:eastAsia="Arial" w:hAnsi="Arial"/>
-                <w:color w:val="666666"/>
-                <w:sz w:val="21"/>
-                <w:szCs w:val="21"/>
-              </w:rPr>
-              <w:t xml:space="preserve">B) Coercion</w:t>
-            </w:r>
-          </w:p>
-        </w:tc>
-      </w:tr>
-      <w:tr>
-        <w:tc>
-          <w:tcPr>
-            <w:tcW w:type="dxa" w:w="9360"/>
-            <w:tcBorders>
-              <w:top w:val="single" w:color="CCCCCC" w:sz="1"/>
-              <w:left w:val="single" w:color="CCCCCC" w:sz="1"/>
-              <w:bottom w:val="single" w:color="CCCCCC" w:sz="1"/>
-              <w:right w:val="single" w:color="CCCCCC" w:sz="1"/>
-            </w:tcBorders>
-            <w:shd w:fill="FFFFFF" w:val="clear"/>
-            <w:tcMar>
-              <w:top w:type="dxa" w:w="60"/>
-              <w:left w:type="dxa" w:w="280"/>
-              <w:bottom w:type="dxa" w:w="60"/>
-              <w:right w:type="dxa" w:w="160"/>
-            </w:tcMar>
-          </w:tcPr>
-          <w:p>
-            <w:r>
-              <w:rPr>
-                <w:rFonts w:ascii="Arial" w:cs="Arial" w:eastAsia="Arial" w:hAnsi="Arial"/>
-                <w:color w:val="666666"/>
-                <w:sz w:val="21"/>
-                <w:szCs w:val="21"/>
-              </w:rPr>
-              <w:t xml:space="preserve">D) Defamation</w:t>
+              <w:t xml:space="preserve">Which of the following is a qualifying event that triggers COBRA continuation coverage for a dependent spouse?</w:t>
+            </w:r>
+          </w:p>
+        </w:tc>
+      </w:tr>
+      <w:tr>
+        <w:tc>
+          <w:tcPr>
+            <w:tcW w:type="dxa" w:w="9360"/>
+            <w:tcBorders>
+              <w:top w:val="single" w:color="CCCCCC" w:sz="1"/>
+              <w:left w:val="single" w:color="CCCCCC" w:sz="1"/>
+              <w:bottom w:val="single" w:color="CCCCCC" w:sz="1"/>
+              <w:right w:val="single" w:color="CCCCCC" w:sz="1"/>
+            </w:tcBorders>
+            <w:shd w:fill="FFFFFF" w:val="clear"/>
+            <w:tcMar>
+              <w:top w:type="dxa" w:w="60"/>
+              <w:left w:type="dxa" w:w="280"/>
+              <w:bottom w:type="dxa" w:w="60"/>
+              <w:right w:type="dxa" w:w="160"/>
+            </w:tcMar>
+          </w:tcPr>
+          <w:p>
+            <w:r>
+              <w:rPr>
+                <w:rFonts w:ascii="Arial" w:cs="Arial" w:eastAsia="Arial" w:hAnsi="Arial"/>
+                <w:color w:val="666666"/>
+                <w:sz w:val="21"/>
+                <w:szCs w:val="21"/>
+              </w:rPr>
+              <w:t xml:space="preserve">A) The employee receives a salary reduction</w:t>
+            </w:r>
+          </w:p>
+        </w:tc>
+      </w:tr>
+      <w:tr>
+        <w:tc>
+          <w:tcPr>
+            <w:tcW w:type="dxa" w:w="9360"/>
+            <w:tcBorders>
+              <w:top w:val="single" w:color="CCCCCC" w:sz="1"/>
+              <w:left w:val="single" w:color="CCCCCC" w:sz="1"/>
+              <w:bottom w:val="single" w:color="CCCCCC" w:sz="1"/>
+              <w:right w:val="single" w:color="CCCCCC" w:sz="1"/>
+            </w:tcBorders>
+            <w:shd w:fill="FFFFFF" w:val="clear"/>
+            <w:tcMar>
+              <w:top w:type="dxa" w:w="60"/>
+              <w:left w:type="dxa" w:w="280"/>
+              <w:bottom w:type="dxa" w:w="60"/>
+              <w:right w:type="dxa" w:w="160"/>
+            </w:tcMar>
+          </w:tcPr>
+          <w:p>
+            <w:r>
+              <w:rPr>
+                <w:rFonts w:ascii="Arial" w:cs="Arial" w:eastAsia="Arial" w:hAnsi="Arial"/>
+                <w:color w:val="666666"/>
+                <w:sz w:val="21"/>
+                <w:szCs w:val="21"/>
+              </w:rPr>
+              <w:t xml:space="preserve">B) The employee changes job responsibilities</w:t>
+            </w:r>
+          </w:p>
+        </w:tc>
+      </w:tr>
+      <w:tr>
+        <w:tc>
+          <w:tcPr>
+            <w:tcW w:type="dxa" w:w="9360"/>
+            <w:tcBorders>
+              <w:top w:val="single" w:color="CCCCCC" w:sz="1"/>
+              <w:left w:val="single" w:color="CCCCCC" w:sz="1"/>
+              <w:bottom w:val="single" w:color="CCCCCC" w:sz="1"/>
+              <w:right w:val="single" w:color="CCCCCC" w:sz="1"/>
+            </w:tcBorders>
+            <w:shd w:fill="FFFFFF" w:val="clear"/>
+            <w:tcMar>
+              <w:top w:type="dxa" w:w="60"/>
+              <w:left w:type="dxa" w:w="280"/>
+              <w:bottom w:type="dxa" w:w="60"/>
+              <w:right w:type="dxa" w:w="160"/>
+            </w:tcMar>
+          </w:tcPr>
+          <w:p>
+            <w:r>
+              <w:rPr>
+                <w:rFonts w:ascii="Arial" w:cs="Arial" w:eastAsia="Arial" w:hAnsi="Arial"/>
+                <w:color w:val="666666"/>
+                <w:sz w:val="21"/>
+                <w:szCs w:val="21"/>
+              </w:rPr>
+              <w:t xml:space="preserve">D) The employee switches to a different group health plan</w:t>
             </w:r>
           </w:p>
         </w:tc>
@@ -22557,7 +22557,7 @@
                 <w:sz w:val="22"/>
                 <w:szCs w:val="22"/>
               </w:rPr>
-              <w:t xml:space="preserve">C) Twisting</w:t>
+              <w:t xml:space="preserve">C) Divorce or legal separation from the covered employee</w:t>
             </w:r>
           </w:p>
         </w:tc>
@@ -22599,7 +22599,7 @@
                 <w:sz w:val="20"/>
                 <w:szCs w:val="20"/>
               </w:rPr>
-              <w:t xml:space="preserve">Twisting involves using misrepresentation or incomplete, misleading comparisons to induce a policyholder to replace an existing policy with a new one to their detriment. It is distinguished from lawful replacement, which uses accurate and complete information.</w:t>
+              <w:t xml:space="preserve">COBRA qualifying events for dependent spouses include: divorce or legal separation, death of the covered employee, the employee becoming entitled to Medicare, or the employee's termination/reduction in hours. Divorce or legal separation entitles the spouse to up to 36 months of continuation coverage.</w:t>
             </w:r>
           </w:p>
         </w:tc>

</xml_diff>